<commit_message>
updated acdf and pcf
</commit_message>
<xml_diff>
--- a/script/Anterior Cervical Discectomy and Fusion.docx
+++ b/script/Anterior Cervical Discectomy and Fusion.docx
@@ -80,7 +80,16 @@
         <w:t>anterior cervical fixation</w:t>
       </w:r>
       <w:r>
-        <w:t>. Compared with posterior cervical decompression and fusion (PCDF), ACDF is</w:t>
+        <w:t xml:space="preserve">. Compared with </w:t>
+      </w:r>
+      <w:r>
+        <w:rPr>
+          <w:color w:val="00B0F0"/>
+        </w:rPr>
+        <w:t>posterior cervical decompression and fusion (PCDF)</w:t>
+      </w:r>
+      <w:r>
+        <w:t>, ACDF is</w:t>
       </w:r>
       <w:r>
         <w:t>…</w:t>
@@ -163,7 +172,17 @@
         <w:t>fixation</w:t>
       </w:r>
       <w:r>
-        <w:t xml:space="preserve">. Compared with posterior cervical decompression and fusion (PCDF), ACDF is performed through </w:t>
+        <w:t xml:space="preserve">. Compared with </w:t>
+      </w:r>
+      <w:r>
+        <w:rPr>
+          <w:color w:val="00B0F0"/>
+          <w:u w:val="single"/>
+        </w:rPr>
+        <w:t>posterior cervical decompression and fusion (PCDF)</w:t>
+      </w:r>
+      <w:r>
+        <w:t xml:space="preserve">, ACDF is performed through </w:t>
       </w:r>
       <w:r>
         <w:t xml:space="preserve">a </w:t>
@@ -238,15 +257,15 @@
         <w:jc w:val="both"/>
       </w:pPr>
       <w:r>
-        <w:t xml:space="preserve">Cervical </w:t>
-      </w:r>
-      <w:r>
-        <w:rPr>
-          <w:color w:val="00B0F0"/>
-        </w:rPr>
-        <w:t>radiculopathy</w:t>
-      </w:r>
-      <w:r>
+        <w:rPr>
+          <w:color w:val="00B0F0"/>
+        </w:rPr>
+        <w:t>Cervical radiculopathy</w:t>
+      </w:r>
+      <w:r>
+        <w:rPr>
+          <w:color w:val="00B0F0"/>
+        </w:rPr>
         <w:t xml:space="preserve"> </w:t>
       </w:r>
       <w:r>
@@ -497,6 +516,9 @@
       <w:r>
         <w:t>Interbody Cage</w:t>
       </w:r>
+      <w:r>
+        <w:t>s</w:t>
+      </w:r>
     </w:p>
     <w:p>
       <w:pPr>
@@ -695,31 +717,6 @@
     <w:p>
       <w:pPr>
         <w:jc w:val="both"/>
-        <w:rPr>
-          <w:color w:val="00B0F0"/>
-        </w:rPr>
-      </w:pPr>
-      <w:r>
-        <w:t xml:space="preserve">Interbody cages and bone grafts are designed to support the fusion process. Over time, new bone grows </w:t>
-      </w:r>
-      <w:r>
-        <w:rPr>
-          <w:color w:val="00B0F0"/>
-        </w:rPr>
-        <w:t>through or around</w:t>
-      </w:r>
-      <w:r>
-        <w:t xml:space="preserve"> the implant, joining the adjacent vertebrae into a single, stable bone.</w:t>
-      </w:r>
-    </w:p>
-    <w:p>
-      <w:pPr>
-        <w:jc w:val="both"/>
-      </w:pPr>
-    </w:p>
-    <w:p>
-      <w:pPr>
-        <w:jc w:val="both"/>
       </w:pPr>
       <w:r>
         <w:t>Scene 4</w:t>
@@ -804,7 +801,6 @@
         <w:t xml:space="preserve">. </w:t>
       </w:r>
       <w:r>
-        <w:lastRenderedPageBreak/>
         <w:t>Interbody cages are designed</w:t>
       </w:r>
       <w:r>
@@ -826,7 +822,19 @@
         <w:rPr>
           <w:color w:val="00B0F0"/>
         </w:rPr>
-        <w:t>through or around</w:t>
+        <w:t xml:space="preserve">through </w:t>
+      </w:r>
+      <w:r>
+        <w:rPr>
+          <w:color w:val="000000" w:themeColor="text1"/>
+        </w:rPr>
+        <w:t>or</w:t>
+      </w:r>
+      <w:r>
+        <w:rPr>
+          <w:color w:val="00B0F0"/>
+        </w:rPr>
+        <w:t xml:space="preserve"> around</w:t>
       </w:r>
       <w:r>
         <w:t xml:space="preserve"> the implant, joining the adjacent vertebrae into a single, stable bone.</w:t>

</xml_diff>